<commit_message>
opus claude added cookie and other features
</commit_message>
<xml_diff>
--- a/backend/templates/original_example.docx
+++ b/backend/templates/original_example.docx
@@ -11601,6 +11601,26 @@
       </w:pPr>
     </w:p>
     <w:p/>
+    <w:p>
+      <w:r>
+        <w:t xml:space="preserve">{#photos}</w:t>
+      </w:r>
+    </w:p>
+    <w:p>
+      <w:r>
+        <w:t xml:space="preserve">{%image}</w:t>
+      </w:r>
+    </w:p>
+    <w:p>
+      <w:r>
+        <w:t xml:space="preserve">Фото: {caption}</w:t>
+      </w:r>
+    </w:p>
+    <w:p>
+      <w:r>
+        <w:t xml:space="preserve">{/photos}</w:t>
+      </w:r>
+    </w:p>
     <w:sectPr>
       <w:footerReference w:type="default" r:id="rId7"/>
       <w:pgSz w:w="11906" w:h="16838"/>

</xml_diff>